<commit_message>
feat: use comment in graphiccard as serial number
</commit_message>
<xml_diff>
--- a/wl_template_with_placeholders_v2.docx
+++ b/wl_template_with_placeholders_v2.docx
@@ -146,21 +146,7 @@
           <w:sz w:val="44"/>
           <w:lang w:val="de-AT"/>
         </w:rPr>
-        <w:t>{{asset_type}}</w:t>
-      </w:r>
-      <w:r>
-        <w:rPr>
-          <w:sz w:val="44"/>
-          <w:lang w:val="de-AT"/>
-        </w:rPr>
-        <w:t xml:space="preserve"> </w:t>
-      </w:r>
-      <w:r>
-        <w:rPr>
-          <w:sz w:val="44"/>
-          <w:lang w:val="de-AT"/>
-        </w:rPr>
-        <w:t>{{asset_name}} {{asset_location}}</w:t>
+        <w:t>{{asset_type}} {{asset_name}} {{asset_location}}</w:t>
       </w:r>
     </w:p>
     <w:p>
@@ -2607,10 +2593,23 @@
     <w:p>
       <w:pPr>
         <w:pStyle w:val="Normal"/>
+        <w:rPr>
+          <w:lang w:val="de-AT"/>
+        </w:rPr>
+      </w:pPr>
+      <w:r>
+        <w:rPr>
+          <w:lang w:val="de-AT"/>
+        </w:rPr>
+      </w:r>
+    </w:p>
+    <w:p>
+      <w:pPr>
+        <w:pStyle w:val="Normal"/>
         <w:rPr/>
       </w:pPr>
-      <w:bookmarkStart w:id="5" w:name="_Ref48023021"/>
-      <w:bookmarkStart w:id="6" w:name="_Toc473541593"/>
+      <w:bookmarkStart w:id="5" w:name="_Toc473541593"/>
+      <w:bookmarkStart w:id="6" w:name="_Ref48023021"/>
       <w:r>
         <w:rPr/>
         <w:t>Allgemeines</w:t>
@@ -3039,10 +3038,10 @@
       </w:tblPr>
       <w:tblGrid>
         <w:gridCol w:w="2520"/>
-        <w:gridCol w:w="1819"/>
-        <w:gridCol w:w="1819"/>
-        <w:gridCol w:w="1711"/>
-        <w:gridCol w:w="1617"/>
+        <w:gridCol w:w="1818"/>
+        <w:gridCol w:w="1820"/>
+        <w:gridCol w:w="1710"/>
+        <w:gridCol w:w="1618"/>
       </w:tblGrid>
       <w:tr>
         <w:trPr/>
@@ -3076,7 +3075,7 @@
         </w:tc>
         <w:tc>
           <w:tcPr>
-            <w:tcW w:w="1819" w:type="dxa"/>
+            <w:tcW w:w="1818" w:type="dxa"/>
             <w:tcBorders>
               <w:end w:val="nil"/>
             </w:tcBorders>
@@ -3106,7 +3105,7 @@
         </w:tc>
         <w:tc>
           <w:tcPr>
-            <w:tcW w:w="1819" w:type="dxa"/>
+            <w:tcW w:w="1820" w:type="dxa"/>
             <w:tcBorders/>
             <w:shd w:color="auto" w:fill="BFBFBF" w:themeFill="background1" w:themeFillShade="bf" w:val="clear"/>
           </w:tcPr>
@@ -3134,7 +3133,7 @@
         </w:tc>
         <w:tc>
           <w:tcPr>
-            <w:tcW w:w="1711" w:type="dxa"/>
+            <w:tcW w:w="1710" w:type="dxa"/>
             <w:tcBorders/>
             <w:shd w:color="auto" w:fill="BFBFBF" w:themeFill="background1" w:themeFillShade="bf" w:val="clear"/>
           </w:tcPr>
@@ -3162,7 +3161,7 @@
         </w:tc>
         <w:tc>
           <w:tcPr>
-            <w:tcW w:w="1617" w:type="dxa"/>
+            <w:tcW w:w="1618" w:type="dxa"/>
             <w:tcBorders/>
             <w:shd w:color="auto" w:fill="BFBFBF" w:themeFill="background1" w:themeFillShade="bf" w:val="clear"/>
           </w:tcPr>
@@ -3227,7 +3226,7 @@
         </w:tc>
         <w:tc>
           <w:tcPr>
-            <w:tcW w:w="1819" w:type="dxa"/>
+            <w:tcW w:w="1818" w:type="dxa"/>
             <w:tcBorders>
               <w:end w:val="nil"/>
             </w:tcBorders>
@@ -3248,21 +3247,13 @@
             </w:pPr>
             <w:r>
               <w:rPr/>
-              <w:t>{{components_processor_</w:t>
-            </w:r>
-            <w:r>
-              <w:rPr/>
-              <w:t>model</w:t>
-            </w:r>
-            <w:r>
-              <w:rPr/>
-              <w:t>}}</w:t>
-            </w:r>
-          </w:p>
-        </w:tc>
-        <w:tc>
-          <w:tcPr>
-            <w:tcW w:w="1819" w:type="dxa"/>
+              <w:t>{{components_processor_model}}</w:t>
+            </w:r>
+          </w:p>
+        </w:tc>
+        <w:tc>
+          <w:tcPr>
+            <w:tcW w:w="1820" w:type="dxa"/>
             <w:tcBorders>
               <w:end w:val="nil"/>
             </w:tcBorders>
@@ -3294,7 +3285,7 @@
         </w:tc>
         <w:tc>
           <w:tcPr>
-            <w:tcW w:w="1711" w:type="dxa"/>
+            <w:tcW w:w="1710" w:type="dxa"/>
             <w:tcBorders>
               <w:end w:val="nil"/>
             </w:tcBorders>
@@ -3326,7 +3317,7 @@
         </w:tc>
         <w:tc>
           <w:tcPr>
-            <w:tcW w:w="1617" w:type="dxa"/>
+            <w:tcW w:w="1618" w:type="dxa"/>
             <w:tcBorders/>
           </w:tcPr>
           <w:p>
@@ -3400,17 +3391,17 @@
         <w:tblLook w:noHBand="0" w:noVBand="1" w:firstColumn="1" w:lastRow="0" w:lastColumn="0" w:firstRow="1" w:val="04a0"/>
       </w:tblPr>
       <w:tblGrid>
-        <w:gridCol w:w="2346"/>
+        <w:gridCol w:w="2345"/>
         <w:gridCol w:w="2346"/>
         <w:gridCol w:w="1695"/>
         <w:gridCol w:w="1593"/>
-        <w:gridCol w:w="1506"/>
+        <w:gridCol w:w="1507"/>
       </w:tblGrid>
       <w:tr>
         <w:trPr/>
         <w:tc>
           <w:tcPr>
-            <w:tcW w:w="2346" w:type="dxa"/>
+            <w:tcW w:w="2345" w:type="dxa"/>
             <w:tcBorders>
               <w:end w:val="nil"/>
             </w:tcBorders>
@@ -3524,7 +3515,7 @@
         </w:tc>
         <w:tc>
           <w:tcPr>
-            <w:tcW w:w="1506" w:type="dxa"/>
+            <w:tcW w:w="1507" w:type="dxa"/>
             <w:tcBorders/>
             <w:shd w:color="auto" w:fill="BFBFBF" w:themeFill="background1" w:themeFillShade="bf" w:val="clear"/>
           </w:tcPr>
@@ -3557,6 +3548,38 @@
         </w:trPr>
         <w:tc>
           <w:tcPr>
+            <w:tcW w:w="2345" w:type="dxa"/>
+            <w:tcBorders>
+              <w:end w:val="nil"/>
+            </w:tcBorders>
+          </w:tcPr>
+          <w:p>
+            <w:pPr>
+              <w:pStyle w:val="Normal"/>
+              <w:widowControl/>
+              <w:suppressAutoHyphens w:val="true"/>
+              <w:spacing w:before="0" w:after="0"/>
+              <w:jc w:val="start"/>
+              <w:rPr>
+                <w:rFonts w:eastAsia="Arial Unicode MS" w:cs="Arial"/>
+                <w:sz w:val="18"/>
+                <w:szCs w:val="18"/>
+                <w:lang w:val="pt-PT"/>
+              </w:rPr>
+            </w:pPr>
+            <w:r>
+              <w:rPr>
+                <w:rFonts w:eastAsia="Arial Unicode MS" w:cs="Arial"/>
+                <w:sz w:val="18"/>
+                <w:szCs w:val="18"/>
+                <w:lang w:val="pt-PT"/>
+              </w:rPr>
+              <w:t>{{components_memory_manufacturer}}</w:t>
+            </w:r>
+          </w:p>
+        </w:tc>
+        <w:tc>
+          <w:tcPr>
             <w:tcW w:w="2346" w:type="dxa"/>
             <w:tcBorders>
               <w:end w:val="nil"/>
@@ -3577,19 +3600,46 @@
               </w:rPr>
             </w:pPr>
             <w:r>
+              <w:rPr/>
+              <w:t>{{components_memory_model}}</w:t>
+            </w:r>
+          </w:p>
+        </w:tc>
+        <w:tc>
+          <w:tcPr>
+            <w:tcW w:w="1695" w:type="dxa"/>
+            <w:tcBorders>
+              <w:end w:val="nil"/>
+            </w:tcBorders>
+          </w:tcPr>
+          <w:p>
+            <w:pPr>
+              <w:pStyle w:val="Normal"/>
+              <w:widowControl/>
+              <w:suppressAutoHyphens w:val="true"/>
+              <w:spacing w:before="0" w:after="0"/>
+              <w:jc w:val="start"/>
               <w:rPr>
                 <w:rFonts w:eastAsia="Arial Unicode MS" w:cs="Arial"/>
                 <w:sz w:val="18"/>
                 <w:szCs w:val="18"/>
                 <w:lang w:val="pt-PT"/>
               </w:rPr>
-              <w:t>{{components_memory_manufacturer}}</w:t>
-            </w:r>
-          </w:p>
-        </w:tc>
-        <w:tc>
-          <w:tcPr>
-            <w:tcW w:w="2346" w:type="dxa"/>
+            </w:pPr>
+            <w:r>
+              <w:rPr>
+                <w:rFonts w:eastAsia="Arial Unicode MS" w:cs="Arial"/>
+                <w:sz w:val="18"/>
+                <w:szCs w:val="18"/>
+                <w:lang w:val="pt-PT"/>
+              </w:rPr>
+              <w:t>{{components_memory_type}}</w:t>
+            </w:r>
+          </w:p>
+        </w:tc>
+        <w:tc>
+          <w:tcPr>
+            <w:tcW w:w="1593" w:type="dxa"/>
             <w:tcBorders>
               <w:end w:val="nil"/>
             </w:tcBorders>
@@ -3609,86 +3659,19 @@
               </w:rPr>
             </w:pPr>
             <w:r>
-              <w:rPr/>
-              <w:t>{{components_memory_</w:t>
-            </w:r>
-            <w:r>
-              <w:rPr/>
-              <w:t>model</w:t>
-            </w:r>
-            <w:r>
-              <w:rPr/>
-              <w:t>}}</w:t>
-            </w:r>
-          </w:p>
-        </w:tc>
-        <w:tc>
-          <w:tcPr>
-            <w:tcW w:w="1695" w:type="dxa"/>
-            <w:tcBorders>
-              <w:end w:val="nil"/>
-            </w:tcBorders>
-          </w:tcPr>
-          <w:p>
-            <w:pPr>
-              <w:pStyle w:val="Normal"/>
-              <w:widowControl/>
-              <w:suppressAutoHyphens w:val="true"/>
-              <w:spacing w:before="0" w:after="0"/>
-              <w:jc w:val="start"/>
               <w:rPr>
                 <w:rFonts w:eastAsia="Arial Unicode MS" w:cs="Arial"/>
                 <w:sz w:val="18"/>
                 <w:szCs w:val="18"/>
                 <w:lang w:val="pt-PT"/>
               </w:rPr>
-            </w:pPr>
-            <w:r>
-              <w:rPr>
-                <w:rFonts w:eastAsia="Arial Unicode MS" w:cs="Arial"/>
-                <w:sz w:val="18"/>
-                <w:szCs w:val="18"/>
-                <w:lang w:val="pt-PT"/>
-              </w:rPr>
-              <w:t>{{components_memory_type}}</w:t>
-            </w:r>
-          </w:p>
-        </w:tc>
-        <w:tc>
-          <w:tcPr>
-            <w:tcW w:w="1593" w:type="dxa"/>
-            <w:tcBorders>
-              <w:end w:val="nil"/>
-            </w:tcBorders>
-          </w:tcPr>
-          <w:p>
-            <w:pPr>
-              <w:pStyle w:val="Normal"/>
-              <w:widowControl/>
-              <w:suppressAutoHyphens w:val="true"/>
-              <w:spacing w:before="0" w:after="0"/>
-              <w:jc w:val="start"/>
-              <w:rPr>
-                <w:rFonts w:eastAsia="Arial Unicode MS" w:cs="Arial"/>
-                <w:sz w:val="18"/>
-                <w:szCs w:val="18"/>
-                <w:lang w:val="pt-PT"/>
-              </w:rPr>
-            </w:pPr>
-            <w:r>
-              <w:rPr>
-                <w:rFonts w:eastAsia="Arial Unicode MS" w:cs="Arial"/>
-                <w:sz w:val="18"/>
-                <w:szCs w:val="18"/>
-                <w:lang w:val="pt-PT"/>
-              </w:rPr>
               <w:t>{{components_memory_size}}</w:t>
             </w:r>
           </w:p>
         </w:tc>
         <w:tc>
           <w:tcPr>
-            <w:tcW w:w="1506" w:type="dxa"/>
+            <w:tcW w:w="1507" w:type="dxa"/>
             <w:tcBorders/>
           </w:tcPr>
           <w:p>
@@ -3762,16 +3745,16 @@
         <w:tblLook w:noHBand="0" w:noVBand="1" w:firstColumn="1" w:lastRow="0" w:lastColumn="0" w:firstRow="1" w:val="04a0"/>
       </w:tblPr>
       <w:tblGrid>
-        <w:gridCol w:w="2346"/>
+        <w:gridCol w:w="2345"/>
         <w:gridCol w:w="2346"/>
         <w:gridCol w:w="1695"/>
-        <w:gridCol w:w="3099"/>
+        <w:gridCol w:w="3100"/>
       </w:tblGrid>
       <w:tr>
         <w:trPr/>
         <w:tc>
           <w:tcPr>
-            <w:tcW w:w="2346" w:type="dxa"/>
+            <w:tcW w:w="2345" w:type="dxa"/>
             <w:tcBorders>
               <w:end w:val="nil"/>
             </w:tcBorders>
@@ -3857,7 +3840,7 @@
         </w:tc>
         <w:tc>
           <w:tcPr>
-            <w:tcW w:w="3099" w:type="dxa"/>
+            <w:tcW w:w="3100" w:type="dxa"/>
             <w:tcBorders/>
             <w:shd w:color="auto" w:fill="BFBFBF" w:themeFill="background1" w:themeFillShade="bf" w:val="clear"/>
           </w:tcPr>
@@ -3890,6 +3873,38 @@
         </w:trPr>
         <w:tc>
           <w:tcPr>
+            <w:tcW w:w="2345" w:type="dxa"/>
+            <w:tcBorders>
+              <w:end w:val="nil"/>
+            </w:tcBorders>
+          </w:tcPr>
+          <w:p>
+            <w:pPr>
+              <w:pStyle w:val="Normal"/>
+              <w:widowControl/>
+              <w:suppressAutoHyphens w:val="true"/>
+              <w:spacing w:before="0" w:after="0"/>
+              <w:jc w:val="start"/>
+              <w:rPr>
+                <w:rFonts w:eastAsia="Arial Unicode MS" w:cs="Arial"/>
+                <w:sz w:val="18"/>
+                <w:szCs w:val="18"/>
+                <w:lang w:val="pt-PT"/>
+              </w:rPr>
+            </w:pPr>
+            <w:r>
+              <w:rPr>
+                <w:rFonts w:eastAsia="Arial Unicode MS" w:cs="Arial"/>
+                <w:sz w:val="18"/>
+                <w:szCs w:val="18"/>
+                <w:lang w:val="pt-PT"/>
+              </w:rPr>
+              <w:t>{{components_harddrive_manufacturer}}</w:t>
+            </w:r>
+          </w:p>
+        </w:tc>
+        <w:tc>
+          <w:tcPr>
             <w:tcW w:w="2346" w:type="dxa"/>
             <w:tcBorders>
               <w:end w:val="nil"/>
@@ -3910,78 +3925,46 @@
               </w:rPr>
             </w:pPr>
             <w:r>
+              <w:rPr/>
+              <w:t>{{components_harddrive_model}}</w:t>
+            </w:r>
+          </w:p>
+        </w:tc>
+        <w:tc>
+          <w:tcPr>
+            <w:tcW w:w="1695" w:type="dxa"/>
+            <w:tcBorders>
+              <w:end w:val="nil"/>
+            </w:tcBorders>
+          </w:tcPr>
+          <w:p>
+            <w:pPr>
+              <w:pStyle w:val="Normal"/>
+              <w:widowControl/>
+              <w:suppressAutoHyphens w:val="true"/>
+              <w:spacing w:before="0" w:after="0"/>
+              <w:jc w:val="start"/>
               <w:rPr>
                 <w:rFonts w:eastAsia="Arial Unicode MS" w:cs="Arial"/>
                 <w:sz w:val="18"/>
                 <w:szCs w:val="18"/>
                 <w:lang w:val="pt-PT"/>
               </w:rPr>
-              <w:t>{{components_harddrive_manufacturer}}</w:t>
-            </w:r>
-          </w:p>
-        </w:tc>
-        <w:tc>
-          <w:tcPr>
-            <w:tcW w:w="2346" w:type="dxa"/>
-            <w:tcBorders>
-              <w:end w:val="nil"/>
-            </w:tcBorders>
-          </w:tcPr>
-          <w:p>
-            <w:pPr>
-              <w:pStyle w:val="Normal"/>
-              <w:widowControl/>
-              <w:suppressAutoHyphens w:val="true"/>
-              <w:spacing w:before="0" w:after="0"/>
-              <w:jc w:val="start"/>
+            </w:pPr>
+            <w:r>
               <w:rPr>
                 <w:rFonts w:eastAsia="Arial Unicode MS" w:cs="Arial"/>
                 <w:sz w:val="18"/>
                 <w:szCs w:val="18"/>
                 <w:lang w:val="pt-PT"/>
               </w:rPr>
-            </w:pPr>
-            <w:r>
-              <w:rPr/>
-              <w:t>{{components_harddrive_model}}</w:t>
-            </w:r>
-          </w:p>
-        </w:tc>
-        <w:tc>
-          <w:tcPr>
-            <w:tcW w:w="1695" w:type="dxa"/>
-            <w:tcBorders>
-              <w:end w:val="nil"/>
-            </w:tcBorders>
-          </w:tcPr>
-          <w:p>
-            <w:pPr>
-              <w:pStyle w:val="Normal"/>
-              <w:widowControl/>
-              <w:suppressAutoHyphens w:val="true"/>
-              <w:spacing w:before="0" w:after="0"/>
-              <w:jc w:val="start"/>
-              <w:rPr>
-                <w:rFonts w:eastAsia="Arial Unicode MS" w:cs="Arial"/>
-                <w:sz w:val="18"/>
-                <w:szCs w:val="18"/>
-                <w:lang w:val="pt-PT"/>
-              </w:rPr>
-            </w:pPr>
-            <w:r>
-              <w:rPr>
-                <w:rFonts w:eastAsia="Arial Unicode MS" w:cs="Arial"/>
-                <w:sz w:val="18"/>
-                <w:szCs w:val="18"/>
-                <w:lang w:val="pt-PT"/>
-              </w:rPr>
               <w:t>{{components_harddrive_type}}</w:t>
             </w:r>
           </w:p>
         </w:tc>
         <w:tc>
           <w:tcPr>
-            <w:tcW w:w="3099" w:type="dxa"/>
+            <w:tcW w:w="3100" w:type="dxa"/>
             <w:tcBorders/>
           </w:tcPr>
           <w:p>
@@ -4055,16 +4038,16 @@
         <w:tblLook w:noHBand="0" w:noVBand="1" w:firstColumn="1" w:lastRow="0" w:lastColumn="0" w:firstRow="1" w:val="04a0"/>
       </w:tblPr>
       <w:tblGrid>
-        <w:gridCol w:w="2346"/>
+        <w:gridCol w:w="2345"/>
         <w:gridCol w:w="2346"/>
         <w:gridCol w:w="1695"/>
-        <w:gridCol w:w="3099"/>
+        <w:gridCol w:w="3100"/>
       </w:tblGrid>
       <w:tr>
         <w:trPr/>
         <w:tc>
           <w:tcPr>
-            <w:tcW w:w="2346" w:type="dxa"/>
+            <w:tcW w:w="2345" w:type="dxa"/>
             <w:tcBorders>
               <w:end w:val="nil"/>
             </w:tcBorders>
@@ -4150,7 +4133,7 @@
         </w:tc>
         <w:tc>
           <w:tcPr>
-            <w:tcW w:w="3099" w:type="dxa"/>
+            <w:tcW w:w="3100" w:type="dxa"/>
             <w:tcBorders/>
             <w:shd w:color="auto" w:fill="BFBFBF" w:themeFill="background1" w:themeFillShade="bf" w:val="clear"/>
           </w:tcPr>
@@ -4183,6 +4166,38 @@
         </w:trPr>
         <w:tc>
           <w:tcPr>
+            <w:tcW w:w="2345" w:type="dxa"/>
+            <w:tcBorders>
+              <w:end w:val="nil"/>
+            </w:tcBorders>
+          </w:tcPr>
+          <w:p>
+            <w:pPr>
+              <w:pStyle w:val="Normal"/>
+              <w:widowControl/>
+              <w:suppressAutoHyphens w:val="true"/>
+              <w:spacing w:before="0" w:after="0"/>
+              <w:jc w:val="start"/>
+              <w:rPr>
+                <w:rFonts w:eastAsia="Arial Unicode MS" w:cs="Arial"/>
+                <w:sz w:val="18"/>
+                <w:szCs w:val="18"/>
+                <w:lang w:val="pt-PT"/>
+              </w:rPr>
+            </w:pPr>
+            <w:r>
+              <w:rPr>
+                <w:rFonts w:eastAsia="Arial Unicode MS" w:cs="Arial"/>
+                <w:sz w:val="18"/>
+                <w:szCs w:val="18"/>
+                <w:lang w:val="pt-PT"/>
+              </w:rPr>
+              <w:t>{{components_networkcard_manufacturer}}</w:t>
+            </w:r>
+          </w:p>
+        </w:tc>
+        <w:tc>
+          <w:tcPr>
             <w:tcW w:w="2346" w:type="dxa"/>
             <w:tcBorders>
               <w:end w:val="nil"/>
@@ -4203,78 +4218,46 @@
               </w:rPr>
             </w:pPr>
             <w:r>
+              <w:rPr/>
+              <w:t>{{components_networkcard_model}}</w:t>
+            </w:r>
+          </w:p>
+        </w:tc>
+        <w:tc>
+          <w:tcPr>
+            <w:tcW w:w="1695" w:type="dxa"/>
+            <w:tcBorders>
+              <w:end w:val="nil"/>
+            </w:tcBorders>
+          </w:tcPr>
+          <w:p>
+            <w:pPr>
+              <w:pStyle w:val="Normal"/>
+              <w:widowControl/>
+              <w:suppressAutoHyphens w:val="true"/>
+              <w:spacing w:before="0" w:after="0"/>
+              <w:jc w:val="start"/>
               <w:rPr>
                 <w:rFonts w:eastAsia="Arial Unicode MS" w:cs="Arial"/>
                 <w:sz w:val="18"/>
                 <w:szCs w:val="18"/>
                 <w:lang w:val="pt-PT"/>
               </w:rPr>
-              <w:t>{{components_networkcard_manufacturer}}</w:t>
-            </w:r>
-          </w:p>
-        </w:tc>
-        <w:tc>
-          <w:tcPr>
-            <w:tcW w:w="2346" w:type="dxa"/>
-            <w:tcBorders>
-              <w:end w:val="nil"/>
-            </w:tcBorders>
-          </w:tcPr>
-          <w:p>
-            <w:pPr>
-              <w:pStyle w:val="Normal"/>
-              <w:widowControl/>
-              <w:suppressAutoHyphens w:val="true"/>
-              <w:spacing w:before="0" w:after="0"/>
-              <w:jc w:val="start"/>
+            </w:pPr>
+            <w:r>
               <w:rPr>
                 <w:rFonts w:eastAsia="Arial Unicode MS" w:cs="Arial"/>
                 <w:sz w:val="18"/>
                 <w:szCs w:val="18"/>
                 <w:lang w:val="pt-PT"/>
               </w:rPr>
-            </w:pPr>
-            <w:r>
-              <w:rPr/>
-              <w:t>{{components_networkcard_model}}</w:t>
-            </w:r>
-          </w:p>
-        </w:tc>
-        <w:tc>
-          <w:tcPr>
-            <w:tcW w:w="1695" w:type="dxa"/>
-            <w:tcBorders>
-              <w:end w:val="nil"/>
-            </w:tcBorders>
-          </w:tcPr>
-          <w:p>
-            <w:pPr>
-              <w:pStyle w:val="Normal"/>
-              <w:widowControl/>
-              <w:suppressAutoHyphens w:val="true"/>
-              <w:spacing w:before="0" w:after="0"/>
-              <w:jc w:val="start"/>
-              <w:rPr>
-                <w:rFonts w:eastAsia="Arial Unicode MS" w:cs="Arial"/>
-                <w:sz w:val="18"/>
-                <w:szCs w:val="18"/>
-                <w:lang w:val="pt-PT"/>
-              </w:rPr>
-            </w:pPr>
-            <w:r>
-              <w:rPr>
-                <w:rFonts w:eastAsia="Arial Unicode MS" w:cs="Arial"/>
-                <w:sz w:val="18"/>
-                <w:szCs w:val="18"/>
-                <w:lang w:val="pt-PT"/>
-              </w:rPr>
               <w:t>{{components_networkcard_flow}}</w:t>
             </w:r>
           </w:p>
         </w:tc>
         <w:tc>
           <w:tcPr>
-            <w:tcW w:w="3099" w:type="dxa"/>
+            <w:tcW w:w="3100" w:type="dxa"/>
             <w:tcBorders/>
           </w:tcPr>
           <w:p>
@@ -4348,16 +4331,17 @@
         <w:tblLook w:noHBand="0" w:noVBand="1" w:firstColumn="1" w:lastRow="0" w:lastColumn="0" w:firstRow="1" w:val="04a0"/>
       </w:tblPr>
       <w:tblGrid>
-        <w:gridCol w:w="1558"/>
-        <w:gridCol w:w="1559"/>
-        <w:gridCol w:w="3185"/>
-        <w:gridCol w:w="3184"/>
+        <w:gridCol w:w="1165"/>
+        <w:gridCol w:w="1168"/>
+        <w:gridCol w:w="2384"/>
+        <w:gridCol w:w="2385"/>
+        <w:gridCol w:w="2384"/>
       </w:tblGrid>
       <w:tr>
         <w:trPr/>
         <w:tc>
           <w:tcPr>
-            <w:tcW w:w="1558" w:type="dxa"/>
+            <w:tcW w:w="1165" w:type="dxa"/>
             <w:tcBorders>
               <w:end w:val="nil"/>
             </w:tcBorders>
@@ -4387,7 +4371,7 @@
         </w:tc>
         <w:tc>
           <w:tcPr>
-            <w:tcW w:w="1559" w:type="dxa"/>
+            <w:tcW w:w="1168" w:type="dxa"/>
             <w:tcBorders/>
             <w:shd w:color="auto" w:fill="BFBFBF" w:themeFill="background1" w:themeFillShade="bf" w:val="clear"/>
           </w:tcPr>
@@ -4415,7 +4399,7 @@
         </w:tc>
         <w:tc>
           <w:tcPr>
-            <w:tcW w:w="3185" w:type="dxa"/>
+            <w:tcW w:w="2384" w:type="dxa"/>
             <w:tcBorders>
               <w:end w:val="nil"/>
             </w:tcBorders>
@@ -4445,8 +4429,10 @@
         </w:tc>
         <w:tc>
           <w:tcPr>
-            <w:tcW w:w="3184" w:type="dxa"/>
-            <w:tcBorders/>
+            <w:tcW w:w="2385" w:type="dxa"/>
+            <w:tcBorders>
+              <w:end w:val="nil"/>
+            </w:tcBorders>
             <w:shd w:color="auto" w:fill="BFBFBF" w:themeFill="background1" w:themeFillShade="bf" w:val="clear"/>
           </w:tcPr>
           <w:p>
@@ -4471,6 +4457,34 @@
             </w:r>
           </w:p>
         </w:tc>
+        <w:tc>
+          <w:tcPr>
+            <w:tcW w:w="2384" w:type="dxa"/>
+            <w:tcBorders/>
+            <w:shd w:color="auto" w:fill="BFBFBF" w:themeFill="background1" w:themeFillShade="bf" w:val="clear"/>
+          </w:tcPr>
+          <w:p>
+            <w:pPr>
+              <w:pStyle w:val="TableHead"/>
+              <w:widowControl/>
+              <w:suppressAutoHyphens w:val="true"/>
+              <w:spacing w:before="60" w:after="60"/>
+              <w:jc w:val="start"/>
+              <w:rPr>
+                <w:rFonts w:ascii="Arial" w:hAnsi="Arial"/>
+                <w:kern w:val="0"/>
+                <w:lang w:bidi="ar-SA"/>
+              </w:rPr>
+            </w:pPr>
+            <w:r>
+              <w:rPr>
+                <w:kern w:val="0"/>
+                <w:lang w:bidi="ar-SA"/>
+              </w:rPr>
+              <w:t>Seriennummer</w:t>
+            </w:r>
+          </w:p>
+        </w:tc>
       </w:tr>
       <w:tr>
         <w:trPr>
@@ -4478,7 +4492,7 @@
         </w:trPr>
         <w:tc>
           <w:tcPr>
-            <w:tcW w:w="1558" w:type="dxa"/>
+            <w:tcW w:w="1165" w:type="dxa"/>
             <w:tcBorders>
               <w:end w:val="nil"/>
             </w:tcBorders>
@@ -4504,16 +4518,34 @@
                 <w:szCs w:val="18"/>
                 <w:lang w:val="pt-PT"/>
               </w:rPr>
-              <w:t>{{components_</w:t>
-            </w:r>
-            <w:r>
+              <w:t>{{components_graphiccard_manufacturer}}</w:t>
+            </w:r>
+          </w:p>
+        </w:tc>
+        <w:tc>
+          <w:tcPr>
+            <w:tcW w:w="1168" w:type="dxa"/>
+            <w:tcBorders>
+              <w:end w:val="nil"/>
+            </w:tcBorders>
+          </w:tcPr>
+          <w:p>
+            <w:pPr>
+              <w:pStyle w:val="Normal"/>
+              <w:widowControl/>
+              <w:suppressAutoHyphens w:val="true"/>
+              <w:spacing w:before="0" w:after="0"/>
+              <w:jc w:val="start"/>
               <w:rPr>
                 <w:rFonts w:eastAsia="Arial Unicode MS" w:cs="Arial"/>
                 <w:sz w:val="18"/>
                 <w:szCs w:val="18"/>
                 <w:lang w:val="pt-PT"/>
               </w:rPr>
-              <w:t>graphiccard</w:t>
+            </w:pPr>
+            <w:r>
+              <w:rPr/>
+              <w:t>{{components_</w:t>
             </w:r>
             <w:r>
               <w:rPr>
@@ -4522,13 +4554,17 @@
                 <w:szCs w:val="18"/>
                 <w:lang w:val="pt-PT"/>
               </w:rPr>
-              <w:t>_manufacturer}}</w:t>
-            </w:r>
-          </w:p>
-        </w:tc>
-        <w:tc>
-          <w:tcPr>
-            <w:tcW w:w="1559" w:type="dxa"/>
+              <w:t>graphiccard</w:t>
+            </w:r>
+            <w:r>
+              <w:rPr/>
+              <w:t>_model}}</w:t>
+            </w:r>
+          </w:p>
+        </w:tc>
+        <w:tc>
+          <w:tcPr>
+            <w:tcW w:w="2384" w:type="dxa"/>
             <w:tcBorders>
               <w:end w:val="nil"/>
             </w:tcBorders>
@@ -4548,27 +4584,19 @@
               </w:rPr>
             </w:pPr>
             <w:r>
-              <w:rPr/>
-              <w:t>{{components_</w:t>
-            </w:r>
-            <w:r>
               <w:rPr>
                 <w:rFonts w:eastAsia="Arial Unicode MS" w:cs="Arial"/>
                 <w:sz w:val="18"/>
                 <w:szCs w:val="18"/>
                 <w:lang w:val="pt-PT"/>
               </w:rPr>
-              <w:t>graphiccard</w:t>
-            </w:r>
-            <w:r>
-              <w:rPr/>
-              <w:t>_model}}</w:t>
-            </w:r>
-          </w:p>
-        </w:tc>
-        <w:tc>
-          <w:tcPr>
-            <w:tcW w:w="3185" w:type="dxa"/>
+              <w:t>{{components_graphiccard_memory}}</w:t>
+            </w:r>
+          </w:p>
+        </w:tc>
+        <w:tc>
+          <w:tcPr>
+            <w:tcW w:w="2385" w:type="dxa"/>
             <w:tcBorders>
               <w:end w:val="nil"/>
             </w:tcBorders>
@@ -4588,86 +4616,37 @@
               </w:rPr>
             </w:pPr>
             <w:r>
+              <w:rPr/>
+              <w:t>{{components_graphiccard_interface}}</w:t>
+            </w:r>
+          </w:p>
+        </w:tc>
+        <w:tc>
+          <w:tcPr>
+            <w:tcW w:w="2384" w:type="dxa"/>
+            <w:tcBorders/>
+          </w:tcPr>
+          <w:p>
+            <w:pPr>
+              <w:pStyle w:val="Normal"/>
+              <w:widowControl/>
+              <w:suppressAutoHyphens w:val="true"/>
+              <w:spacing w:before="0" w:after="0"/>
+              <w:jc w:val="start"/>
               <w:rPr>
                 <w:rFonts w:eastAsia="Arial Unicode MS" w:cs="Arial"/>
                 <w:sz w:val="18"/>
                 <w:szCs w:val="18"/>
                 <w:lang w:val="pt-PT"/>
               </w:rPr>
-              <w:t>{{components_</w:t>
-            </w:r>
-            <w:r>
-              <w:rPr>
-                <w:rFonts w:eastAsia="Arial Unicode MS" w:cs="Arial"/>
-                <w:sz w:val="18"/>
-                <w:szCs w:val="18"/>
-                <w:lang w:val="pt-PT"/>
-              </w:rPr>
-              <w:t>graphiccard</w:t>
-            </w:r>
-            <w:r>
-              <w:rPr>
-                <w:rFonts w:eastAsia="Arial Unicode MS" w:cs="Arial"/>
-                <w:sz w:val="18"/>
-                <w:szCs w:val="18"/>
-                <w:lang w:val="pt-PT"/>
-              </w:rPr>
-              <w:t>_</w:t>
-            </w:r>
-            <w:r>
-              <w:rPr>
-                <w:rFonts w:eastAsia="Arial Unicode MS" w:cs="Arial"/>
-                <w:sz w:val="18"/>
-                <w:szCs w:val="18"/>
-                <w:lang w:val="pt-PT"/>
-              </w:rPr>
-              <w:t>memory</w:t>
-            </w:r>
-            <w:r>
-              <w:rPr>
-                <w:rFonts w:eastAsia="Arial Unicode MS" w:cs="Arial"/>
-                <w:sz w:val="18"/>
-                <w:szCs w:val="18"/>
-                <w:lang w:val="pt-PT"/>
-              </w:rPr>
-              <w:t>}}</w:t>
-            </w:r>
-          </w:p>
-        </w:tc>
-        <w:tc>
-          <w:tcPr>
-            <w:tcW w:w="3184" w:type="dxa"/>
-            <w:tcBorders/>
-          </w:tcPr>
-          <w:p>
-            <w:pPr>
-              <w:pStyle w:val="Normal"/>
-              <w:widowControl/>
-              <w:suppressAutoHyphens w:val="true"/>
-              <w:spacing w:before="0" w:after="0"/>
-              <w:jc w:val="start"/>
-              <w:rPr>
-                <w:rFonts w:eastAsia="Arial Unicode MS" w:cs="Arial"/>
-                <w:sz w:val="18"/>
-                <w:szCs w:val="18"/>
-                <w:lang w:val="pt-PT"/>
-              </w:rPr>
             </w:pPr>
             <w:r>
               <w:rPr/>
-              <w:t>{{components_</w:t>
+              <w:t>{{components_graphiccard_</w:t>
             </w:r>
             <w:r>
               <w:rPr/>
-              <w:t>graphiccard</w:t>
-            </w:r>
-            <w:r>
-              <w:rPr/>
-              <w:t>_</w:t>
-            </w:r>
-            <w:r>
-              <w:rPr/>
-              <w:t>interface</w:t>
+              <w:t>comment</w:t>
             </w:r>
             <w:r>
               <w:rPr/>
@@ -4722,9 +4701,9 @@
       </w:tblPr>
       <w:tblGrid>
         <w:gridCol w:w="2575"/>
-        <w:gridCol w:w="1859"/>
+        <w:gridCol w:w="1858"/>
         <w:gridCol w:w="1749"/>
-        <w:gridCol w:w="1652"/>
+        <w:gridCol w:w="1653"/>
         <w:gridCol w:w="1651"/>
       </w:tblGrid>
       <w:tr>
@@ -4759,7 +4738,7 @@
         </w:tc>
         <w:tc>
           <w:tcPr>
-            <w:tcW w:w="1859" w:type="dxa"/>
+            <w:tcW w:w="1858" w:type="dxa"/>
             <w:tcBorders/>
             <w:shd w:color="auto" w:fill="BFBFBF" w:themeFill="background1" w:themeFillShade="bf" w:val="clear"/>
           </w:tcPr>
@@ -4815,7 +4794,7 @@
         </w:tc>
         <w:tc>
           <w:tcPr>
-            <w:tcW w:w="1652" w:type="dxa"/>
+            <w:tcW w:w="1653" w:type="dxa"/>
             <w:tcBorders>
               <w:end w:val="nil"/>
             </w:tcBorders>
@@ -4910,7 +4889,7 @@
         </w:tc>
         <w:tc>
           <w:tcPr>
-            <w:tcW w:w="1859" w:type="dxa"/>
+            <w:tcW w:w="1858" w:type="dxa"/>
             <w:tcBorders>
               <w:end w:val="nil"/>
             </w:tcBorders>
@@ -4974,7 +4953,7 @@
         </w:tc>
         <w:tc>
           <w:tcPr>
-            <w:tcW w:w="1652" w:type="dxa"/>
+            <w:tcW w:w="1653" w:type="dxa"/>
             <w:tcBorders>
               <w:end w:val="nil"/>
             </w:tcBorders>
@@ -5025,15 +5004,7 @@
             </w:pPr>
             <w:r>
               <w:rPr/>
-              <w:t>{{monitors_s</w:t>
-            </w:r>
-            <w:r>
-              <w:rPr/>
-              <w:t>erial_number</w:t>
-            </w:r>
-            <w:r>
-              <w:rPr/>
-              <w:t>}}</w:t>
+              <w:t>{{monitors_serial_number}}</w:t>
             </w:r>
           </w:p>
         </w:tc>
@@ -6410,8 +6381,8 @@
       <w:tblLook w:noHBand="0" w:noVBand="0" w:firstColumn="0" w:lastRow="0" w:lastColumn="0" w:firstRow="0" w:val="0000"/>
     </w:tblPr>
     <w:tblGrid>
-      <w:gridCol w:w="2546"/>
-      <w:gridCol w:w="7094"/>
+      <w:gridCol w:w="2545"/>
+      <w:gridCol w:w="7095"/>
     </w:tblGrid>
     <w:tr>
       <w:trPr>
@@ -6419,7 +6390,7 @@
       </w:trPr>
       <w:tc>
         <w:tcPr>
-          <w:tcW w:w="2546" w:type="dxa"/>
+          <w:tcW w:w="2545" w:type="dxa"/>
           <w:tcBorders>
             <w:bottom w:val="single" w:sz="12" w:space="0" w:color="000000"/>
           </w:tcBorders>
@@ -6454,14 +6425,14 @@
               <v:shape id="ole_rId1" type="_x0000_tole_rId1" style="width:114.6pt;height:19.8pt;mso-wrap-distance-right:0pt" filled="f" o:ole="">
                 <v:imagedata r:id="rId2" o:title=""/>
               </v:shape>
-              <o:OLEObject Type="Embed" ProgID="MSDraw" ShapeID="ole_rId1" DrawAspect="Content" ObjectID="_1963589777" r:id="rId1"/>
+              <o:OLEObject Type="Embed" ProgID="MSDraw" ShapeID="ole_rId1" DrawAspect="Content" ObjectID="_1122085717" r:id="rId1"/>
             </w:object>
           </w:r>
         </w:p>
       </w:tc>
       <w:tc>
         <w:tcPr>
-          <w:tcW w:w="7094" w:type="dxa"/>
+          <w:tcW w:w="7095" w:type="dxa"/>
           <w:tcBorders>
             <w:bottom w:val="single" w:sz="12" w:space="0" w:color="000000"/>
           </w:tcBorders>
@@ -6512,8 +6483,8 @@
       <w:tblLook w:noHBand="0" w:noVBand="0" w:firstColumn="0" w:lastRow="0" w:lastColumn="0" w:firstRow="0" w:val="0000"/>
     </w:tblPr>
     <w:tblGrid>
-      <w:gridCol w:w="2546"/>
-      <w:gridCol w:w="7094"/>
+      <w:gridCol w:w="2545"/>
+      <w:gridCol w:w="7095"/>
     </w:tblGrid>
     <w:tr>
       <w:trPr>
@@ -6521,7 +6492,7 @@
       </w:trPr>
       <w:tc>
         <w:tcPr>
-          <w:tcW w:w="2546" w:type="dxa"/>
+          <w:tcW w:w="2545" w:type="dxa"/>
           <w:tcBorders>
             <w:bottom w:val="single" w:sz="12" w:space="0" w:color="000000"/>
           </w:tcBorders>
@@ -6556,14 +6527,14 @@
               <v:shape id="ole_rId1" type="_x0000_tole_rId1" style="width:114.6pt;height:19.8pt;mso-wrap-distance-right:0pt" filled="f" o:ole="">
                 <v:imagedata r:id="rId2" o:title=""/>
               </v:shape>
-              <o:OLEObject Type="Embed" ProgID="MSDraw" ShapeID="ole_rId1" DrawAspect="Content" ObjectID="_1043768815" r:id="rId1"/>
+              <o:OLEObject Type="Embed" ProgID="MSDraw" ShapeID="ole_rId1" DrawAspect="Content" ObjectID="_191775979" r:id="rId1"/>
             </w:object>
           </w:r>
         </w:p>
       </w:tc>
       <w:tc>
         <w:tcPr>
-          <w:tcW w:w="7094" w:type="dxa"/>
+          <w:tcW w:w="7095" w:type="dxa"/>
           <w:tcBorders>
             <w:bottom w:val="single" w:sz="12" w:space="0" w:color="000000"/>
           </w:tcBorders>
@@ -8087,15 +8058,15 @@
       <w:lang w:val="de-DE" w:eastAsia="de-DE"/>
     </w:rPr>
   </w:style>
-  <w:style w:type="character" w:styleId="FootnoteCharactersuser">
-    <w:name w:val="Footnote Characters (user)"/>
+  <w:style w:type="character" w:styleId="FootnoteCharacters">
+    <w:name w:val="Footnote Characters"/>
     <w:qFormat/>
     <w:rPr>
       <w:vertAlign w:val="superscript"/>
     </w:rPr>
   </w:style>
-  <w:style w:type="character" w:styleId="FootnoteCharacters">
-    <w:name w:val="Footnote Characters"/>
+  <w:style w:type="character" w:styleId="FootnoteCharactersuser">
+    <w:name w:val="Footnote Characters (user)"/>
     <w:qFormat/>
     <w:rPr>
       <w:vertAlign w:val="superscript"/>
@@ -8862,15 +8833,15 @@
       <w:lang w:val="es-ES"/>
     </w:rPr>
   </w:style>
-  <w:style w:type="paragraph" w:styleId="FrameContentsuser">
-    <w:name w:val="Frame Contents (user)"/>
+  <w:style w:type="paragraph" w:styleId="FrameContents">
+    <w:name w:val="Frame Contents"/>
     <w:basedOn w:val="Normal"/>
     <w:qFormat/>
     <w:pPr/>
     <w:rPr/>
   </w:style>
-  <w:style w:type="paragraph" w:styleId="FrameContents">
-    <w:name w:val="Frame Contents"/>
+  <w:style w:type="paragraph" w:styleId="FrameContentsuser">
+    <w:name w:val="Frame Contents (user)"/>
     <w:basedOn w:val="Normal"/>
     <w:qFormat/>
     <w:pPr/>

</xml_diff>